<commit_message>
Update preprint with GitHub URL + ORCID iD; regenerate DOCX
</commit_message>
<xml_diff>
--- a/projects/egfr_demo/aidiscovery/preprint.docx
+++ b/projects/egfr_demo/aidiscovery/preprint.docx
@@ -2,7 +2,7 @@
 <file path=word/document.xml><?xml version="1.0" encoding="utf-8"?>
 <w:document xmlns:w="http://schemas.openxmlformats.org/wordprocessingml/2006/main" xmlns:m="http://schemas.openxmlformats.org/officeDocument/2006/math" xmlns:r="http://schemas.openxmlformats.org/officeDocument/2006/relationships" xmlns:o="urn:schemas-microsoft-com:office:office" xmlns:v="urn:schemas-microsoft-com:vml" xmlns:w10="urn:schemas-microsoft-com:office:word" xmlns:a="http://schemas.openxmlformats.org/drawingml/2006/main" xmlns:pic="http://schemas.openxmlformats.org/drawingml/2006/picture" xmlns:wp="http://schemas.openxmlformats.org/drawingml/2006/wordprocessingDrawing">
   <w:body>
-    <w:bookmarkStart w:id="40" w:name="X0b19f47c890c390eb438f6a68f30bb684c9a326"/>
+    <w:bookmarkStart w:id="41" w:name="X0b19f47c890c390eb438f6a68f30bb684c9a326"/>
     <w:p>
       <w:pPr>
         <w:pStyle w:val="Heading1"/>
@@ -21,6 +21,26 @@
           <w:bCs/>
         </w:rPr>
         <w:t xml:space="preserve">Maytham Muthanna Muneam¹*</w:t>
+      </w:r>
+      <w:r>
+        <w:t xml:space="preserve"> </w:t>
+      </w:r>
+      <w:r>
+        <w:t xml:space="preserve">(ORCID:</w:t>
+      </w:r>
+      <w:r>
+        <w:t xml:space="preserve"> </w:t>
+      </w:r>
+      <w:hyperlink r:id="rId9">
+        <w:r>
+          <w:rPr>
+            <w:rStyle w:val="Hyperlink"/>
+          </w:rPr>
+          <w:t xml:space="preserve">0000-0003-4528-4716</w:t>
+        </w:r>
+      </w:hyperlink>
+      <w:r>
+        <w:t xml:space="preserve">)</w:t>
       </w:r>
     </w:p>
     <w:p>
@@ -70,7 +90,7 @@
         </w:pict>
       </w:r>
     </w:p>
-    <w:bookmarkStart w:id="9" w:name="author-summary"/>
+    <w:bookmarkStart w:id="10" w:name="author-summary"/>
     <w:p>
       <w:pPr>
         <w:pStyle w:val="Heading2"/>
@@ -117,8 +137,8 @@
         </w:pict>
       </w:r>
     </w:p>
-    <w:bookmarkEnd w:id="9"/>
-    <w:bookmarkStart w:id="10" w:name="abstract"/>
+    <w:bookmarkEnd w:id="10"/>
+    <w:bookmarkStart w:id="11" w:name="abstract"/>
     <w:p>
       <w:pPr>
         <w:pStyle w:val="Heading2"/>
@@ -204,8 +224,8 @@
         </w:pict>
       </w:r>
     </w:p>
-    <w:bookmarkEnd w:id="10"/>
-    <w:bookmarkStart w:id="11" w:name="introduction"/>
+    <w:bookmarkEnd w:id="11"/>
+    <w:bookmarkStart w:id="12" w:name="introduction"/>
     <w:p>
       <w:pPr>
         <w:pStyle w:val="Heading2"/>
@@ -355,8 +375,8 @@
         </w:pict>
       </w:r>
     </w:p>
-    <w:bookmarkEnd w:id="11"/>
-    <w:bookmarkStart w:id="19" w:name="methods"/>
+    <w:bookmarkEnd w:id="12"/>
+    <w:bookmarkStart w:id="20" w:name="methods"/>
     <w:p>
       <w:pPr>
         <w:pStyle w:val="Heading2"/>
@@ -365,7 +385,7 @@
         <w:t xml:space="preserve">2 Methods</w:t>
       </w:r>
     </w:p>
-    <w:bookmarkStart w:id="12" w:name="pipeline-overview"/>
+    <w:bookmarkStart w:id="13" w:name="pipeline-overview"/>
     <w:p>
       <w:pPr>
         <w:pStyle w:val="Heading3"/>
@@ -664,8 +684,8 @@
         <w:t xml:space="preserve">                          lead nomination</w:t>
       </w:r>
     </w:p>
-    <w:bookmarkEnd w:id="12"/>
-    <w:bookmarkStart w:id="13" w:name="llm-design-step"/>
+    <w:bookmarkEnd w:id="13"/>
+    <w:bookmarkStart w:id="14" w:name="llm-design-step"/>
     <w:p>
       <w:pPr>
         <w:pStyle w:val="Heading3"/>
@@ -682,8 +702,8 @@
         <w:t xml:space="preserve">Each round invokes Claude with the target description (4ZAU active site, Met790M gatekeeper context, selectivity objective) and the top-K SMILES from the previous round annotated with their Vina ΔG values. The LLM is instructed to (a) propose N novel analogues that exploit the Met790M hydrophobic pocket, (b) include a one-sentence rationale per molecule, and (c) return strictly structured JSON. Round 1 uses no feedback (de novo); rounds 2–3 are conditioned on the top 5 hits from the prior round.</w:t>
       </w:r>
     </w:p>
-    <w:bookmarkEnd w:id="13"/>
-    <w:bookmarkStart w:id="14" w:name="filtering"/>
+    <w:bookmarkEnd w:id="14"/>
+    <w:bookmarkStart w:id="15" w:name="filtering"/>
     <w:p>
       <w:pPr>
         <w:pStyle w:val="Heading3"/>
@@ -700,8 +720,8 @@
         <w:t xml:space="preserve">Each proposal is screened with RDKit for: valid SMILES, Lipinski rule-of-five, Veber, PAINS / Brenk / NIH catalogs, a synthetic-accessibility approximation (SA ≤ 6), and Morgan-fingerprint Tanimoto novelty (≥ 0.4) versus an optional reference library.</w:t>
       </w:r>
     </w:p>
-    <w:bookmarkEnd w:id="14"/>
-    <w:bookmarkStart w:id="15" w:name="docking"/>
+    <w:bookmarkEnd w:id="15"/>
+    <w:bookmarkStart w:id="16" w:name="docking"/>
     <w:p>
       <w:pPr>
         <w:pStyle w:val="Heading3"/>
@@ -745,8 +765,8 @@
         <w:t xml:space="preserve">. The grid box is auto-defined from the co-crystallized ligand AQ4 (erlotinib analogue in 4ZAU) with 8 Å padding. The wild-type comparison uses 1M17 with the same box-definition procedure on its co-crystal ligand.</w:t>
       </w:r>
     </w:p>
-    <w:bookmarkEnd w:id="15"/>
-    <w:bookmarkStart w:id="16" w:name="mm-gbsa-rescoring"/>
+    <w:bookmarkEnd w:id="16"/>
+    <w:bookmarkStart w:id="17" w:name="mm-gbsa-rescoring"/>
     <w:p>
       <w:pPr>
         <w:pStyle w:val="Heading3"/>
@@ -855,8 +875,8 @@
         <w:t xml:space="preserve">ΔΔG_MMGBSA = ΔG_wt − ΔG_mut (positive ⇒ mutant-selective).</w:t>
       </w:r>
     </w:p>
-    <w:bookmarkEnd w:id="16"/>
-    <w:bookmarkStart w:id="17" w:name="md-pose-stability-triage"/>
+    <w:bookmarkEnd w:id="17"/>
+    <w:bookmarkStart w:id="18" w:name="md-pose-stability-triage"/>
     <w:p>
       <w:pPr>
         <w:pStyle w:val="Heading3"/>
@@ -905,8 +925,8 @@
         <w:t xml:space="preserve">max COM drift &lt; 4 Å; values just above threshold are flagged as borderline rather than rejected.</w:t>
       </w:r>
     </w:p>
-    <w:bookmarkEnd w:id="17"/>
-    <w:bookmarkStart w:id="18" w:name="software-and-reproducibility"/>
+    <w:bookmarkEnd w:id="18"/>
+    <w:bookmarkStart w:id="19" w:name="software-and-reproducibility"/>
     <w:p>
       <w:pPr>
         <w:pStyle w:val="Heading3"/>
@@ -920,7 +940,7 @@
         <w:pStyle w:val="FirstParagraph"/>
       </w:pPr>
       <w:r>
-        <w:t xml:space="preserve">All code is in pure Python (3.11) and runs on a single workstation. Dependencies: RDKit 2024.x, OpenMM 8.x, OpenFF Toolkit 0.18, openmmforcefields 0.16, MDAnalysis 2.x, AutoDock Vina 1.2, OpenBabel 3.x, PDBFixer, Anthropic Python SDK. No commercial software is required. The full codebase, environment specification, prepared receptor, all intermediate files, and final tables are available at [GitHub URL TBD].</w:t>
+        <w:t xml:space="preserve">All code is in pure Python (3.11) and runs on a single workstation. Dependencies: RDKit 2024.x, OpenMM 8.x, OpenFF Toolkit 0.18, openmmforcefields 0.16, MDAnalysis 2.x, AutoDock Vina 1.2, OpenBabel 3.x, PDBFixer, Anthropic Python SDK. No commercial software is required. The full codebase, environment specification, prepared receptor, all intermediate files, and final tables are available at https://github.com/Maytham-altaan/SchrodingerLite.</w:t>
       </w:r>
     </w:p>
     <w:p>
@@ -930,9 +950,9 @@
         </w:pict>
       </w:r>
     </w:p>
-    <w:bookmarkEnd w:id="18"/>
     <w:bookmarkEnd w:id="19"/>
-    <w:bookmarkStart w:id="26" w:name="results"/>
+    <w:bookmarkEnd w:id="20"/>
+    <w:bookmarkStart w:id="27" w:name="results"/>
     <w:p>
       <w:pPr>
         <w:pStyle w:val="Heading2"/>
@@ -941,7 +961,7 @@
         <w:t xml:space="preserve">3 Results</w:t>
       </w:r>
     </w:p>
-    <w:bookmarkStart w:id="20" w:name="design-campaign"/>
+    <w:bookmarkStart w:id="21" w:name="design-campaign"/>
     <w:p>
       <w:pPr>
         <w:pStyle w:val="Heading3"/>
@@ -1010,8 +1030,8 @@
         <w:t xml:space="preserve">appeared in round 1 attached to a benzimidazole carboxamide, and in round 2 attached to an unrelated pyridopyrimidinone). Eight such collisions occurred among the 27 unique molecules. Additionally, the LLM proposed two structurally identical molecules under different names across rounds. Both issues are now handled by the pipeline via canonical-SMILES de-duplication and round-suffixed unique naming at the merge step.</w:t>
       </w:r>
     </w:p>
-    <w:bookmarkEnd w:id="20"/>
-    <w:bookmarkStart w:id="21" w:name="selectivity-check"/>
+    <w:bookmarkEnd w:id="21"/>
+    <w:bookmarkStart w:id="22" w:name="selectivity-check"/>
     <w:p>
       <w:pPr>
         <w:pStyle w:val="Heading3"/>
@@ -1044,8 +1064,8 @@
         <w:t xml:space="preserve">(Vina ΔΔG = +1.24), is also the highest-affinity mutant binder (Vina ΔG = −9.91 kcal/mol), suggesting that the CF₃-fluorobenzyl substituent contributes both to potency and to mutant discrimination — consistent with the design hypothesis of Met790M hydrophobic-pocket occupation.</w:t>
       </w:r>
     </w:p>
-    <w:bookmarkEnd w:id="21"/>
-    <w:bookmarkStart w:id="22" w:name="mm-gbsa-rescoring-1"/>
+    <w:bookmarkEnd w:id="22"/>
+    <w:bookmarkStart w:id="23" w:name="mm-gbsa-rescoring-1"/>
     <w:p>
       <w:pPr>
         <w:pStyle w:val="Heading3"/>
@@ -1070,8 +1090,8 @@
         <w:t xml:space="preserve">Absolute MM-GBSA ΔG_bind values are inflated by residual bond-strain artifacts in the docked geometry (range +0 to +82 kcal/mol) and should not be interpreted as binding free energies. However, the relative ΔΔG (mutant − wild-type for the same ligand) cancels these artifacts and is internally consistent.</w:t>
       </w:r>
     </w:p>
-    <w:bookmarkEnd w:id="22"/>
-    <w:bookmarkStart w:id="23" w:name="md-pose-stability"/>
+    <w:bookmarkEnd w:id="23"/>
+    <w:bookmarkStart w:id="24" w:name="md-pose-stability"/>
     <w:p>
       <w:pPr>
         <w:pStyle w:val="Heading3"/>
@@ -1145,8 +1165,8 @@
         <w:t xml:space="preserve">: RMSD mean 1.68 Å, max 3.08 Å (barely above strict threshold). Stable pose but non-selective by both Vina and MM-GBSA.</w:t>
       </w:r>
     </w:p>
-    <w:bookmarkEnd w:id="23"/>
-    <w:bookmarkStart w:id="24" w:name="lead-nomination"/>
+    <w:bookmarkEnd w:id="24"/>
+    <w:bookmarkStart w:id="25" w:name="lead-nomination"/>
     <w:p>
       <w:pPr>
         <w:pStyle w:val="Heading3"/>
@@ -1195,8 +1215,8 @@
         <w:t xml:space="preserve">for parallel synthesis. EGFR-TM-012 should be deprioritized due to method disagreement on selectivity, and EGFR-TM-014 due to confirmed non-selectivity by both scoring methods.</w:t>
       </w:r>
     </w:p>
-    <w:bookmarkEnd w:id="24"/>
-    <w:bookmarkStart w:id="25" w:name="Xd46b7c399f7765415b1c580568f8db52b5551aa"/>
+    <w:bookmarkEnd w:id="25"/>
+    <w:bookmarkStart w:id="26" w:name="Xd46b7c399f7765415b1c580568f8db52b5551aa"/>
     <w:p>
       <w:pPr>
         <w:pStyle w:val="Heading3"/>
@@ -1687,9 +1707,9 @@
         </w:pict>
       </w:r>
     </w:p>
-    <w:bookmarkEnd w:id="25"/>
     <w:bookmarkEnd w:id="26"/>
-    <w:bookmarkStart w:id="31" w:name="discussion"/>
+    <w:bookmarkEnd w:id="27"/>
+    <w:bookmarkStart w:id="32" w:name="discussion"/>
     <w:p>
       <w:pPr>
         <w:pStyle w:val="Heading2"/>
@@ -1698,7 +1718,7 @@
         <w:t xml:space="preserve">4 Discussion</w:t>
       </w:r>
     </w:p>
-    <w:bookmarkStart w:id="27" w:name="the-case-for-interpretable-llm-design"/>
+    <w:bookmarkStart w:id="28" w:name="the-case-for-interpretable-llm-design"/>
     <w:p>
       <w:pPr>
         <w:pStyle w:val="Heading3"/>
@@ -1731,8 +1751,8 @@
         <w:t xml:space="preserve">reasoning correctly but failing quantitatively. This is the opposite failure mode from neural-network generators, which often produce quantitatively reasonable scores but no testable hypothesis. We argue that interpretability is a substantive practical advantage when the eventual goal is medicinal-chemist hand-off and SAR exploration: a rationale survives optimization rounds and informs analogue design even when the original molecule is dropped.</w:t>
       </w:r>
     </w:p>
-    <w:bookmarkEnd w:id="27"/>
-    <w:bookmarkStart w:id="28" w:name="the-value-of-multi-method-consensus"/>
+    <w:bookmarkEnd w:id="28"/>
+    <w:bookmarkStart w:id="29" w:name="the-value-of-multi-method-consensus"/>
     <w:p>
       <w:pPr>
         <w:pStyle w:val="Heading3"/>
@@ -1765,8 +1785,8 @@
         <w:t xml:space="preserve">signal that justifies committing to a synthesis target.</w:t>
       </w:r>
     </w:p>
-    <w:bookmarkEnd w:id="28"/>
-    <w:bookmarkStart w:id="29" w:name="limitations"/>
+    <w:bookmarkEnd w:id="29"/>
+    <w:bookmarkStart w:id="30" w:name="limitations"/>
     <w:p>
       <w:pPr>
         <w:pStyle w:val="Heading3"/>
@@ -1879,8 +1899,8 @@
         <w:t xml:space="preserve">Generalization to targets that the model has not seen in training is untested.</w:t>
       </w:r>
     </w:p>
-    <w:bookmarkEnd w:id="29"/>
-    <w:bookmarkStart w:id="30" w:name="reproducibility-on-commodity-hardware"/>
+    <w:bookmarkEnd w:id="30"/>
+    <w:bookmarkStart w:id="31" w:name="reproducibility-on-commodity-hardware"/>
     <w:p>
       <w:pPr>
         <w:pStyle w:val="Heading3"/>
@@ -1904,9 +1924,9 @@
         </w:pict>
       </w:r>
     </w:p>
-    <w:bookmarkEnd w:id="30"/>
     <w:bookmarkEnd w:id="31"/>
-    <w:bookmarkStart w:id="32" w:name="conclusion"/>
+    <w:bookmarkEnd w:id="32"/>
+    <w:bookmarkStart w:id="33" w:name="conclusion"/>
     <w:p>
       <w:pPr>
         <w:pStyle w:val="Heading2"/>
@@ -1930,8 +1950,8 @@
         </w:pict>
       </w:r>
     </w:p>
-    <w:bookmarkEnd w:id="32"/>
-    <w:bookmarkStart w:id="33" w:name="data-and-code-availability"/>
+    <w:bookmarkEnd w:id="33"/>
+    <w:bookmarkStart w:id="34" w:name="data-and-code-availability"/>
     <w:p>
       <w:pPr>
         <w:pStyle w:val="Heading2"/>
@@ -1967,7 +1987,7 @@
         <w:t xml:space="preserve"> </w:t>
       </w:r>
       <w:r>
-        <w:t xml:space="preserve">[URL TBD]</w:t>
+        <w:t xml:space="preserve">https://github.com/Maytham-altaan/SchrodingerLite</w:t>
       </w:r>
       <w:r>
         <w:t xml:space="preserve"> </w:t>
@@ -2227,8 +2247,8 @@
         <w:t xml:space="preserve"> 2</w:t>
       </w:r>
     </w:p>
-    <w:bookmarkEnd w:id="33"/>
-    <w:bookmarkStart w:id="34" w:name="acknowledgments"/>
+    <w:bookmarkEnd w:id="34"/>
+    <w:bookmarkStart w:id="35" w:name="acknowledgments"/>
     <w:p>
       <w:pPr>
         <w:pStyle w:val="Heading2"/>
@@ -2245,8 +2265,8 @@
         <w:t xml:space="preserve">This work was conducted independently by the author without external grant funding or institutional computational resources. All calculations were performed on a personal Apple Silicon workstation. The author thanks Anthropic for API access to Claude Opus 4.7 (research credits), and the open-source maintainers of RDKit, OpenMM, OpenFF Toolkit, openmmforcefields, MDAnalysis, AutoDock Vina, OpenBabel, and PDBFixer, whose freely available tools made this campaign possible without commercial-suite licensing.</w:t>
       </w:r>
     </w:p>
-    <w:bookmarkEnd w:id="34"/>
-    <w:bookmarkStart w:id="35" w:name="author-contributions"/>
+    <w:bookmarkEnd w:id="35"/>
+    <w:bookmarkStart w:id="36" w:name="author-contributions"/>
     <w:p>
       <w:pPr>
         <w:pStyle w:val="Heading2"/>
@@ -2263,8 +2283,8 @@
         <w:t xml:space="preserve">M.M.M. conceived the project, designed and implemented the pipeline, ran all computations, analyzed the data, prepared the figures, and wrote the manuscript.</w:t>
       </w:r>
     </w:p>
-    <w:bookmarkEnd w:id="35"/>
-    <w:bookmarkStart w:id="36" w:name="conflicts-of-interest"/>
+    <w:bookmarkEnd w:id="36"/>
+    <w:bookmarkStart w:id="37" w:name="conflicts-of-interest"/>
     <w:p>
       <w:pPr>
         <w:pStyle w:val="Heading2"/>
@@ -2281,8 +2301,8 @@
         <w:t xml:space="preserve">The author declares no competing interests.</w:t>
       </w:r>
     </w:p>
-    <w:bookmarkEnd w:id="36"/>
-    <w:bookmarkStart w:id="37" w:name="references"/>
+    <w:bookmarkEnd w:id="37"/>
+    <w:bookmarkStart w:id="38" w:name="references"/>
     <w:p>
       <w:pPr>
         <w:pStyle w:val="Heading2"/>
@@ -3370,8 +3390,8 @@
         <w:t xml:space="preserve">, D668–D672.</w:t>
       </w:r>
     </w:p>
-    <w:bookmarkEnd w:id="37"/>
-    <w:bookmarkStart w:id="38" w:name="figures"/>
+    <w:bookmarkEnd w:id="38"/>
+    <w:bookmarkStart w:id="39" w:name="figures"/>
     <w:p>
       <w:pPr>
         <w:pStyle w:val="Heading2"/>
@@ -3473,8 +3493,8 @@
         <w:t xml:space="preserve">]: Top-5 unique hits with Vina mutant scores. Note scaffold diversity (pyridopyrimidinone, pyrazolo-indazole amide, naphthyridine, isoquinoline, benzimidazole).</w:t>
       </w:r>
     </w:p>
-    <w:bookmarkEnd w:id="38"/>
-    <w:bookmarkStart w:id="39" w:name="supplementary-information"/>
+    <w:bookmarkEnd w:id="39"/>
+    <w:bookmarkStart w:id="40" w:name="supplementary-information"/>
     <w:p>
       <w:pPr>
         <w:pStyle w:val="Heading2"/>
@@ -3591,8 +3611,8 @@
         <w:t xml:space="preserve">: LLM-generated med-chem summary of the final top-10 (preserved verbatim from the original campaign).</w:t>
       </w:r>
     </w:p>
-    <w:bookmarkEnd w:id="39"/>
     <w:bookmarkEnd w:id="40"/>
+    <w:bookmarkEnd w:id="41"/>
     <w:sectPr>
       <w:footnotePr>
         <w:numRestart w:val="eachSect"/>

</xml_diff>